<commit_message>
añadida lectura del body con formato negrita y cursiva
</commit_message>
<xml_diff>
--- a/temp/v38n2a2 (1) (006).docx
+++ b/temp/v38n2a2 (1) (006).docx
@@ -900,7 +900,6 @@
           <w:rFonts w:ascii="Times New Roman" w:hAnsi="Times New Roman" w:cs="Times New Roman"/>
           <w:sz w:val="24"/>
           <w:szCs w:val="24"/>
-          <w:lang w:val="en-US"/>
         </w:rPr>
         <w:t xml:space="preserve">González-Sanguino, C., Castellanos, M. A., Santos-Olmo, A. B., Zamorano, S., Ausín, B., </w:t>
       </w:r>
@@ -909,7 +908,6 @@
           <w:rFonts w:ascii="Times New Roman" w:hAnsi="Times New Roman" w:cs="Times New Roman"/>
           <w:sz w:val="24"/>
           <w:szCs w:val="24"/>
-          <w:lang w:val="en-US"/>
         </w:rPr>
         <w:t>&amp;</w:t>
       </w:r>
@@ -918,7 +916,6 @@
           <w:rFonts w:ascii="Times New Roman" w:hAnsi="Times New Roman" w:cs="Times New Roman"/>
           <w:sz w:val="24"/>
           <w:szCs w:val="24"/>
-          <w:lang w:val="en-US"/>
         </w:rPr>
         <w:t xml:space="preserve"> Muñoz, M</w:t>
       </w:r>
@@ -927,7 +924,6 @@
           <w:rFonts w:ascii="Times New Roman" w:hAnsi="Times New Roman" w:cs="Times New Roman"/>
           <w:sz w:val="24"/>
           <w:szCs w:val="24"/>
-          <w:lang w:val="en-US"/>
         </w:rPr>
         <w:t>. (2026).</w:t>
       </w:r>
@@ -936,9 +932,37 @@
           <w:rFonts w:ascii="Times New Roman" w:hAnsi="Times New Roman" w:cs="Times New Roman"/>
           <w:sz w:val="24"/>
           <w:szCs w:val="24"/>
-          <w:lang w:val="en-US"/>
-        </w:rPr>
-        <w:t xml:space="preserve"> The influence of gender on measuring mental health stigma. A cross-sectional vignette study with the Attribution Questionnaire 9</w:t>
+        </w:rPr>
+        <w:t xml:space="preserve"> </w:t>
+      </w:r>
+      <w:r>
+        <w:rPr>
+          <w:rFonts w:ascii="Times New Roman" w:hAnsi="Times New Roman" w:cs="Times New Roman"/>
+          <w:sz w:val="24"/>
+          <w:szCs w:val="24"/>
+          <w:lang w:val="en-US"/>
+        </w:rPr>
+        <w:t xml:space="preserve">The influence of gender on measuring mental health stigma. A cross-sectional vignette study with </w:t>
+      </w:r>
+      <w:proofErr w:type="gramStart"/>
+      <w:r>
+        <w:rPr>
+          <w:rFonts w:ascii="Times New Roman" w:hAnsi="Times New Roman" w:cs="Times New Roman"/>
+          <w:sz w:val="24"/>
+          <w:szCs w:val="24"/>
+          <w:lang w:val="en-US"/>
+        </w:rPr>
+        <w:t>the Attribution</w:t>
+      </w:r>
+      <w:proofErr w:type="gramEnd"/>
+      <w:r>
+        <w:rPr>
+          <w:rFonts w:ascii="Times New Roman" w:hAnsi="Times New Roman" w:cs="Times New Roman"/>
+          <w:sz w:val="24"/>
+          <w:szCs w:val="24"/>
+          <w:lang w:val="en-US"/>
+        </w:rPr>
+        <w:t xml:space="preserve"> Questionnaire 9</w:t>
       </w:r>
       <w:r>
         <w:rPr>
@@ -1571,7 +1595,17 @@
           <w:sz w:val="24"/>
           <w:szCs w:val="24"/>
         </w:rPr>
-        <w:t xml:space="preserve">)   XXX  </w:t>
+        <w:t xml:space="preserve">)   </w:t>
+      </w:r>
+      <w:proofErr w:type="gramStart"/>
+      <w:r>
+        <w:rPr>
+          <w:rFonts w:ascii="Times New Roman" w:hAnsi="Times New Roman" w:cs="Times New Roman"/>
+          <w:bCs/>
+          <w:sz w:val="24"/>
+          <w:szCs w:val="24"/>
+        </w:rPr>
+        <w:t xml:space="preserve">XXX  </w:t>
       </w:r>
       <w:proofErr w:type="spellStart"/>
       <w:r>
@@ -1584,6 +1618,7 @@
         <w:t>XXX</w:t>
       </w:r>
       <w:proofErr w:type="spellEnd"/>
+      <w:proofErr w:type="gramEnd"/>
       <w:r>
         <w:rPr>
           <w:rFonts w:ascii="Times New Roman" w:hAnsi="Times New Roman" w:cs="Times New Roman"/>
@@ -1880,7 +1915,18 @@
           <w:sz w:val="24"/>
           <w:szCs w:val="24"/>
         </w:rPr>
-        <w:t xml:space="preserve"> en español:</w:t>
+        <w:t xml:space="preserve"> en </w:t>
+      </w:r>
+      <w:proofErr w:type="gramStart"/>
+      <w:r>
+        <w:rPr>
+          <w:rFonts w:ascii="Times New Roman" w:hAnsi="Times New Roman" w:cs="Times New Roman"/>
+          <w:b/>
+          <w:bCs/>
+          <w:sz w:val="24"/>
+          <w:szCs w:val="24"/>
+        </w:rPr>
+        <w:t>español:</w:t>
       </w:r>
       <w:bookmarkEnd w:id="5"/>
       <w:r>
@@ -1892,7 +1938,19 @@
           <w:sz w:val="24"/>
           <w:szCs w:val="24"/>
         </w:rPr>
-        <w:t>Antecedentes:</w:t>
+        <w:t>Antecedentes</w:t>
+      </w:r>
+      <w:proofErr w:type="gramEnd"/>
+      <w:r>
+        <w:rPr>
+          <w:rFonts w:ascii="Times New Roman" w:hAnsi="Times New Roman" w:cs="Times New Roman"/>
+          <w:b/>
+          <w:bCs/>
+          <w:color w:val="4472C4" w:themeColor="accent5"/>
+          <w:sz w:val="24"/>
+          <w:szCs w:val="24"/>
+        </w:rPr>
+        <w:t>:</w:t>
       </w:r>
       <w:r>
         <w:rPr>
@@ -2279,7 +2337,16 @@
           <w:lang w:val="en-US"/>
         </w:rPr>
         <w:lastRenderedPageBreak/>
-        <w:t xml:space="preserve">Stigma related to mental health problems (MHP) is a dynamic social process that encompasses negative thoughts, feelings, and behaviors directed at individuals with a diagnosis </w:t>
+        <w:t>Stigma related to mental health problems (MHP)</w:t>
+      </w:r>
+      <w:r>
+        <w:rPr>
+          <w:rFonts w:ascii="Times New Roman" w:hAnsi="Times New Roman" w:cs="Times New Roman"/>
+          <w:sz w:val="24"/>
+          <w:szCs w:val="24"/>
+          <w:lang w:val="en-US"/>
+        </w:rPr>
+        <w:t xml:space="preserve"> is a dynamic social process that encompasses negative thoughts, feelings, and behaviors directed at individuals with a diagnosis </w:t>
       </w:r>
       <w:r>
         <w:rPr>
@@ -3962,7 +4029,7 @@
           <w:rFonts w:ascii="Times New Roman" w:hAnsi="Times New Roman" w:cs="Times New Roman"/>
           <w:sz w:val="24"/>
           <w:szCs w:val="24"/>
-          <w:lang w:val="en-US"/>
+          <w:lang w:val="it-IT"/>
         </w:rPr>
         <w:t xml:space="preserve">In Uganda, Lee et al. </w:t>
       </w:r>
@@ -3979,7 +4046,7 @@
           <w:rFonts w:ascii="Times New Roman" w:hAnsi="Times New Roman" w:cs="Times New Roman"/>
           <w:sz w:val="24"/>
           <w:szCs w:val="24"/>
-          <w:lang w:val="en-US"/>
+          <w:lang w:val="it-IT"/>
         </w:rPr>
         <w:instrText xml:space="preserve"> ADDIN ZOTERO_ITEM CSL_CITATION {"citationID":"c3llCY0F","properties":{"formattedCitation":"(Lee et\\uc0\\u160{}al., 2024)","plainCitation":"(Lee et al., 2024)","dontUpdate":true,"noteIndex":0},"citationItems":[{"id":3427,"uris":["http://zotero.org/users/10015858/items/6XFQL8AZ"],"itemData":{"id":3427,"type":"article-journal","abstract":"Understanding and eliminating mental illness stigma is crucial for improving population mental health. In many settings, this stigma is gendered, from the perspectives of both the stigmatized and the stigmatizers. We aimed to find the differences in the level of stigma across different mental disorders while considering the gender of the study participants as well as the gender of the people depicted in the vignettes. This was a population-based, experimental vignette study conducted in Buyende District of Eastern Uganda in 2023. We created 8 vignettes describing both men and women with alcohol use disorder, major depressive disorder, generalized anxiety disorder, and schizophrenia consistent with DSM-5 criteria. Participants from 20 villages in rural Buyende District of Uganda (N = 379) were first read a randomly selected vignette and administered a survey eliciting their attitudes (Personal Acceptance Scale [PAS] and Broad Acceptance Scale [BAS]) towards the person depicted in the vignette. We used analysis of variance (ANOVA) with Bonferroni-adjusted, empirical p-values to compare levels of acceptance across disorders and genders. Attitudes towards people with mental illness, as measured by the PAS, varied across different mental disorders (p = 0.002). In pairwise mean comparisons, the greater acceptance of anxiety disorder vs. schizophrenia was statistically significant (Mean [SD] PAS: 2.91 [3.15] vs 1.62 [1.95], p = 0.008). Secondary analyses examining differences in acceptance across gender combinations within mental disorders showed that PAS varied across gender combinations for depression (p = 0.017), suggesting that acceptance is higher for women with depression than men with depression. In this population-based vignette study from rural Uganda, we found that people with schizophrenia were less accepted compared to people with anxiety disorders. We also found that there was greater acceptance of women with depression than men with depression. Anti-stigma initiatives may need to be targeted to specific disorders and genders. Trial registration: The experimental procedures for this study were registered with ClinicalTrials.gov as “Survey Experiment to Estimate Level of Mental Illness Stigma Based on Condition and Gender” (NCT 06279962).","container-title":"PLOS Mental Health","DOI":"10.1371/journal.pmen.0000069","ISSN":"2837-8156","issue":"1","journalAbbreviation":"PLOS Mental Health","language":"en","note":"publisher: Public Library of Science","page":"e0000069","source":"PLoS Journals","title":"Differences in mental illness stigma by disorder and gender: Population-based vignette randomized experiment in rural Uganda","title-short":"Differences in mental illness stigma by disorder and gender","volume":"1","author":[{"family":"Lee","given":"Yang Jae"},{"family":"Christ","given":"Ryan"},{"family":"Mbabazi","given":"Rita"},{"family":"Dabagia","given":"Jackson"},{"family":"Prendergast","given":"Alison"},{"family":"Wykoff","given":"Jason"},{"family":"Dasari","given":"Samhitha"},{"family":"Safai","given":"Dylan"},{"family":"Nakaweesi","given":"Shakira"},{"family":"Aturinde","given":"Swaib Rashid"},{"family":"Galvin","given":"Michael"},{"family":"Akena","given":"Dickens"},{"family":"Ashaba","given":"Scholastic"},{"family":"Waiswa","given":"Peter"},{"family":"Rosenheck","given":"Robert"},{"family":"Tsai","given":"Alexander C."}],"issued":{"date-parts":[["2024",6,21]]}}}],"schema":"https://github.com/citation-style-language/schema/raw/master/csl-citation.json"} </w:instrText>
       </w:r>
@@ -3996,7 +4063,7 @@
           <w:rFonts w:ascii="Times New Roman" w:hAnsi="Times New Roman" w:cs="Times New Roman"/>
           <w:sz w:val="24"/>
           <w:szCs w:val="24"/>
-          <w:lang w:val="en-US"/>
+          <w:lang w:val="it-IT"/>
         </w:rPr>
         <w:t>(2024)</w:t>
       </w:r>
@@ -4013,9 +4080,9 @@
           <w:rFonts w:ascii="Times New Roman" w:hAnsi="Times New Roman" w:cs="Times New Roman"/>
           <w:sz w:val="24"/>
           <w:szCs w:val="24"/>
-          <w:lang w:val="en-US"/>
-        </w:rPr>
-        <w:t>, found greater acceptance of women with depression compared to men. As did Kasahara-</w:t>
+          <w:lang w:val="it-IT"/>
+        </w:rPr>
+        <w:t xml:space="preserve">, </w:t>
       </w:r>
       <w:proofErr w:type="spellStart"/>
       <w:r>
@@ -4023,9 +4090,9 @@
           <w:rFonts w:ascii="Times New Roman" w:hAnsi="Times New Roman" w:cs="Times New Roman"/>
           <w:sz w:val="24"/>
           <w:szCs w:val="24"/>
-          <w:lang w:val="en-US"/>
-        </w:rPr>
-        <w:t>Kiritani</w:t>
+          <w:lang w:val="it-IT"/>
+        </w:rPr>
+        <w:t>found</w:t>
       </w:r>
       <w:proofErr w:type="spellEnd"/>
       <w:r>
@@ -4033,7 +4100,263 @@
           <w:rFonts w:ascii="Times New Roman" w:hAnsi="Times New Roman" w:cs="Times New Roman"/>
           <w:sz w:val="24"/>
           <w:szCs w:val="24"/>
-          <w:lang w:val="en-US"/>
+          <w:lang w:val="it-IT"/>
+        </w:rPr>
+        <w:t xml:space="preserve"> </w:t>
+      </w:r>
+      <w:proofErr w:type="spellStart"/>
+      <w:r>
+        <w:rPr>
+          <w:rFonts w:ascii="Times New Roman" w:hAnsi="Times New Roman" w:cs="Times New Roman"/>
+          <w:sz w:val="24"/>
+          <w:szCs w:val="24"/>
+          <w:lang w:val="it-IT"/>
+        </w:rPr>
+        <w:t>greater</w:t>
+      </w:r>
+      <w:proofErr w:type="spellEnd"/>
+      <w:r>
+        <w:rPr>
+          <w:rFonts w:ascii="Times New Roman" w:hAnsi="Times New Roman" w:cs="Times New Roman"/>
+          <w:sz w:val="24"/>
+          <w:szCs w:val="24"/>
+          <w:lang w:val="it-IT"/>
+        </w:rPr>
+        <w:t xml:space="preserve"> </w:t>
+      </w:r>
+      <w:proofErr w:type="spellStart"/>
+      <w:r>
+        <w:rPr>
+          <w:rFonts w:ascii="Times New Roman" w:hAnsi="Times New Roman" w:cs="Times New Roman"/>
+          <w:sz w:val="24"/>
+          <w:szCs w:val="24"/>
+          <w:lang w:val="it-IT"/>
+        </w:rPr>
+        <w:t>acceptance</w:t>
+      </w:r>
+      <w:proofErr w:type="spellEnd"/>
+      <w:r>
+        <w:rPr>
+          <w:rFonts w:ascii="Times New Roman" w:hAnsi="Times New Roman" w:cs="Times New Roman"/>
+          <w:sz w:val="24"/>
+          <w:szCs w:val="24"/>
+          <w:lang w:val="it-IT"/>
+        </w:rPr>
+        <w:t xml:space="preserve"> of women with </w:t>
+      </w:r>
+      <w:proofErr w:type="spellStart"/>
+      <w:r>
+        <w:rPr>
+          <w:rFonts w:ascii="Times New Roman" w:hAnsi="Times New Roman" w:cs="Times New Roman"/>
+          <w:sz w:val="24"/>
+          <w:szCs w:val="24"/>
+          <w:lang w:val="it-IT"/>
+        </w:rPr>
+        <w:t>depression</w:t>
+      </w:r>
+      <w:proofErr w:type="spellEnd"/>
+      <w:r>
+        <w:rPr>
+          <w:rFonts w:ascii="Times New Roman" w:hAnsi="Times New Roman" w:cs="Times New Roman"/>
+          <w:sz w:val="24"/>
+          <w:szCs w:val="24"/>
+          <w:lang w:val="it-IT"/>
+        </w:rPr>
+        <w:t xml:space="preserve"> </w:t>
+      </w:r>
+      <w:proofErr w:type="spellStart"/>
+      <w:r>
+        <w:rPr>
+          <w:rFonts w:ascii="Times New Roman" w:hAnsi="Times New Roman" w:cs="Times New Roman"/>
+          <w:sz w:val="24"/>
+          <w:szCs w:val="24"/>
+          <w:lang w:val="it-IT"/>
+        </w:rPr>
+        <w:t>compared</w:t>
+      </w:r>
+      <w:proofErr w:type="spellEnd"/>
+      <w:r>
+        <w:rPr>
+          <w:rFonts w:ascii="Times New Roman" w:hAnsi="Times New Roman" w:cs="Times New Roman"/>
+          <w:sz w:val="24"/>
+          <w:szCs w:val="24"/>
+          <w:lang w:val="it-IT"/>
+        </w:rPr>
+        <w:t xml:space="preserve"> to men. </w:t>
+      </w:r>
+      <w:r>
+        <w:rPr>
+          <w:rFonts w:ascii="Times New Roman" w:hAnsi="Times New Roman" w:cs="Times New Roman"/>
+          <w:sz w:val="24"/>
+          <w:szCs w:val="24"/>
+          <w:lang w:val="en-US"/>
+        </w:rPr>
+        <w:t xml:space="preserve">As did Kasahara-Kiritani et al. </w:t>
+      </w:r>
+      <w:r>
+        <w:rPr>
+          <w:rFonts w:ascii="Times New Roman" w:hAnsi="Times New Roman" w:cs="Times New Roman"/>
+          <w:sz w:val="24"/>
+          <w:szCs w:val="24"/>
+        </w:rPr>
+        <w:fldChar w:fldCharType="begin"/>
+      </w:r>
+      <w:r>
+        <w:rPr>
+          <w:rFonts w:ascii="Times New Roman" w:hAnsi="Times New Roman" w:cs="Times New Roman"/>
+          <w:sz w:val="24"/>
+          <w:szCs w:val="24"/>
+          <w:lang w:val="en-US"/>
+        </w:rPr>
+        <w:instrText xml:space="preserve"> ADDIN ZOTERO_ITEM CSL_CITATION {"citationID":"JCibVKJW","properties":{"formattedCitation":"(Kasahara-Kiritani et\\uc0\\u160{}al., 2018)","plainCitation":"(Kasahara-Kiritani et al., 2018)","dontUpdate":true,"noteIndex":0},"citationItems":[{"id":3432,"uris":["http://zotero.org/users/10015858/items/G9GRN5CN"],"itemData":{"id":3432,"type":"article-journal","abstract":"Aim\nThe purpose was to characterize public perceptions in Japan of mental illness and how they related to stigma-related attitudes for the same.\nMethods\nData were obtained using a vignette survey conducted as a part of the Stigma in Global Context - Mental Health Study and contained a nationally representative sample (n = 994). The survey was conducted using a multi-mode approach (face-to-face interviews, the drop-off-and-pick-up, postal collection) from September to December 2006, with a multi-stage probability sample of Japane</w:instrText>
+      </w:r>
+      <w:r>
+        <w:rPr>
+          <w:rFonts w:ascii="Times New Roman" w:hAnsi="Times New Roman" w:cs="Times New Roman"/>
+          <w:sz w:val="24"/>
+          <w:szCs w:val="24"/>
+          <w:lang w:val="en-US"/>
+        </w:rPr>
+        <w:instrText>se residents aged 18–64 years. Respondents were randomly assigned one of four vignette conditions that described psychiatric disorders meeting the diagnostic criteria for schizophrenia and major depressive disorder (one vignette for each gender exhibiting each diagnosis). We compared respondents’ stigma-related attitudes and perceptions toward mental illness between vignettes.\nResults\nOver 80% of Japanese participants believed that depressive disorder or schizophrenia could be cured via treatment. However, Japanese people still had relatively strong vigi</w:instrText>
+      </w:r>
+      <w:r>
+        <w:rPr>
+          <w:rFonts w:ascii="Times New Roman" w:hAnsi="Times New Roman" w:cs="Times New Roman"/>
+          <w:sz w:val="24"/>
+          <w:szCs w:val="24"/>
+          <w:lang w:val="en-US"/>
+        </w:rPr>
+        <w:instrText xml:space="preserve">lance and denial of competency toward schizophrenia.\nConclusions\nParticipants expressed the belief that mental illnesses are curable, but stigma toward people with schizophrenia was still relatively strong.","container-title":"Asian Journal of Psychiatry","DOI":"10.1016/j.ajp.2018.05.021","ISSN":"1876-2018","journalAbbreviation":"Asian Journal of Psychiatry","page":"55-60","source":"ScienceDirect","title":"Public perceptions toward mental illness in Japan","volume":"35","author":[{"family":"Kasahara-Kiritani","given":"Mami"},{"family":"Matoba","given":"Tomoko"},{"family":"Kikuzawa","given":"Saeko"},{"family":"Sakano","given":"Junko"},{"family":"Sugiyama","given":"Katsumi"},{"family":"Yamaki","given":"Chikako"},{"family":"Mochizuki","given":"Mieko"},{"family":"Yamazaki","given":"Yoshihiko"}],"issued":{"date-parts":[["2018",6,1]]}}}],"schema":"https://github.com/citation-style-language/schema/raw/master/csl-citation.json"} </w:instrText>
+      </w:r>
+      <w:r>
+        <w:rPr>
+          <w:rFonts w:ascii="Times New Roman" w:hAnsi="Times New Roman" w:cs="Times New Roman"/>
+          <w:sz w:val="24"/>
+          <w:szCs w:val="24"/>
+        </w:rPr>
+        <w:fldChar w:fldCharType="separate"/>
+      </w:r>
+      <w:r>
+        <w:rPr>
+          <w:rFonts w:ascii="Times New Roman" w:hAnsi="Times New Roman" w:cs="Times New Roman"/>
+          <w:sz w:val="24"/>
+          <w:szCs w:val="24"/>
+          <w:lang w:val="en-US"/>
+        </w:rPr>
+        <w:t>(2018)</w:t>
+      </w:r>
+      <w:r>
+        <w:rPr>
+          <w:rFonts w:ascii="Times New Roman" w:hAnsi="Times New Roman" w:cs="Times New Roman"/>
+          <w:sz w:val="24"/>
+          <w:szCs w:val="24"/>
+        </w:rPr>
+        <w:fldChar w:fldCharType="end"/>
+      </w:r>
+      <w:r>
+        <w:rPr>
+          <w:rFonts w:ascii="Times New Roman" w:hAnsi="Times New Roman" w:cs="Times New Roman"/>
+          <w:sz w:val="24"/>
+          <w:szCs w:val="24"/>
+          <w:lang w:val="en-US"/>
+        </w:rPr>
+        <w:t>, in Japan, where men with depression we</w:t>
+      </w:r>
+      <w:r>
+        <w:rPr>
+          <w:rFonts w:ascii="Times New Roman" w:hAnsi="Times New Roman" w:cs="Times New Roman"/>
+          <w:sz w:val="24"/>
+          <w:szCs w:val="24"/>
+          <w:lang w:val="en-US"/>
+        </w:rPr>
+        <w:t xml:space="preserve">re more stigmatized than women. </w:t>
+      </w:r>
+      <w:r>
+        <w:rPr>
+          <w:rFonts w:ascii="Times New Roman" w:hAnsi="Times New Roman" w:cs="Times New Roman"/>
+          <w:sz w:val="24"/>
+          <w:szCs w:val="24"/>
+          <w:lang w:val="en-GB"/>
+        </w:rPr>
+        <w:t xml:space="preserve">Anderson et al. </w:t>
+      </w:r>
+      <w:r>
+        <w:rPr>
+          <w:rFonts w:ascii="Times New Roman" w:hAnsi="Times New Roman" w:cs="Times New Roman"/>
+          <w:sz w:val="24"/>
+          <w:szCs w:val="24"/>
+        </w:rPr>
+        <w:fldChar w:fldCharType="begin"/>
+      </w:r>
+      <w:r>
+        <w:rPr>
+          <w:rFonts w:ascii="Times New Roman" w:hAnsi="Times New Roman" w:cs="Times New Roman"/>
+          <w:sz w:val="24"/>
+          <w:szCs w:val="24"/>
+          <w:lang w:val="en-GB"/>
+        </w:rPr>
+        <w:instrText xml:space="preserve"> ADDIN ZOTERO_ITEM CSL_CITATION {"citationID":"UyJRDQGr","properties":{"formattedCitation":"(Anderson et\\uc0\\u160{}al., 2015)","plainCitation":"(Anderson et al., 2015)","dontUpdate":true,"noteIndex":0},"citationItems":[{"id":3435,"uris":["http://zotero.org/users/10015858/items/YVNU5ISR"],"itemData":{"id":3435,"type":"article-journal","abstract":"Despite the availability of effective interventions, most individuals with social anxiety disorder do not seek treatment. Given their fear of negative evaluation, socially anxious individuals might be especially susceptible to stigma concerns, a recognized barrier for mental health treatment. However, very little is known about the stigma specific to social anxiety disorder. In a design similar to Feldman and Crandall (2007), university undergraduate students read vignettes about target individuals with a generic mental illness label, major depressive disorder, and social anxiety disorder. Subjects rated each of 3 people in the vignettes on social distance and 17 dimensions including dangerousness, heritability and prevalence of the disorder, and gender ratio. Results indicated that being male and not having experience with mental health treatment was associated with somewhat greater preferred social distance. Multiple regression analyses revealed that being embarrassed by the disorder and dangerousness predicted social distance across all 3 vignettes. The vignette for social anxiety disorder had the most complex model and included work impairment, more common among women, and more avoidable. These results have implications for understanding the specific aspects of the stigma associated with social anxiety disorder. Public service messages to reduce stigma should focus on more accurate information about dangerousness and mental illness, given this is an established aspect of mental illness stigma. More nuanced messages about social anxiety might be best incorporated into the treatment referral process and as part of treatment. (PsycINFO Database Record (c) 2016 APA, all rights reserved)","container-title":"American Journal of Orthopsychiatry","DOI":"10.1037/ort0000046","ISSN":"1939-0025","issue":"2","note":"publisher-place: US\npublisher: Educational Publishing Foundation","page":"131-138","source":"APA PsycNet","title":"How people evaluate others with social anxiety disorder: A comparison to depression and general mental illness stigma","title-short":"How people evaluate others with social anxiety disorder","volume":"85","author":[{"family":"Anderson","given":"Kristin N."},{"family":"Jeon","given":"Andrew B."},{"family":"Blenner","given":"Jordan A."},{"family":"Wiener","given":"Richard L."},{"family":"Hope","given":"Debra A."}],"issued":{"date-parts":[["2015"]]}}}],"schema":"https://github.com/citation-style-language/schema/raw/master/csl-citation.json"} </w:instrText>
+      </w:r>
+      <w:r>
+        <w:rPr>
+          <w:rFonts w:ascii="Times New Roman" w:hAnsi="Times New Roman" w:cs="Times New Roman"/>
+          <w:sz w:val="24"/>
+          <w:szCs w:val="24"/>
+        </w:rPr>
+        <w:fldChar w:fldCharType="separate"/>
+      </w:r>
+      <w:r>
+        <w:rPr>
+          <w:rFonts w:ascii="Times New Roman" w:hAnsi="Times New Roman" w:cs="Times New Roman"/>
+          <w:sz w:val="24"/>
+          <w:szCs w:val="24"/>
+          <w:lang w:val="en-US"/>
+        </w:rPr>
+        <w:t>(2015)</w:t>
+      </w:r>
+      <w:r>
+        <w:rPr>
+          <w:rFonts w:ascii="Times New Roman" w:hAnsi="Times New Roman" w:cs="Times New Roman"/>
+          <w:sz w:val="24"/>
+          <w:szCs w:val="24"/>
+        </w:rPr>
+        <w:fldChar w:fldCharType="end"/>
+      </w:r>
+      <w:r>
+        <w:rPr>
+          <w:rFonts w:ascii="Times New Roman" w:hAnsi="Times New Roman" w:cs="Times New Roman"/>
+          <w:sz w:val="24"/>
+          <w:szCs w:val="24"/>
+          <w:lang w:val="en-US"/>
+        </w:rPr>
+        <w:t xml:space="preserve">, who found that the vignette of a man who was not under treatment was associated with a greater desire for social distance than the vignette of a woman. </w:t>
+      </w:r>
+      <w:r>
+        <w:rPr>
+          <w:rFonts w:ascii="Times New Roman" w:hAnsi="Times New Roman" w:cs="Times New Roman"/>
+          <w:sz w:val="24"/>
+          <w:szCs w:val="24"/>
+          <w:lang w:val="en-GB"/>
+        </w:rPr>
+        <w:t xml:space="preserve">In the same vein, </w:t>
+      </w:r>
+      <w:proofErr w:type="spellStart"/>
+      <w:r>
+        <w:rPr>
+          <w:rFonts w:ascii="Times New Roman" w:hAnsi="Times New Roman" w:cs="Times New Roman"/>
+          <w:sz w:val="24"/>
+          <w:szCs w:val="24"/>
+          <w:lang w:val="en-GB"/>
+        </w:rPr>
+        <w:t>Sowislo</w:t>
+      </w:r>
+      <w:proofErr w:type="spellEnd"/>
+      <w:r>
+        <w:rPr>
+          <w:rFonts w:ascii="Times New Roman" w:hAnsi="Times New Roman" w:cs="Times New Roman"/>
+          <w:sz w:val="24"/>
+          <w:szCs w:val="24"/>
+          <w:lang w:val="en-GB"/>
         </w:rPr>
         <w:t xml:space="preserve"> et al. </w:t>
       </w:r>
@@ -4050,9 +4373,9 @@
           <w:rFonts w:ascii="Times New Roman" w:hAnsi="Times New Roman" w:cs="Times New Roman"/>
           <w:sz w:val="24"/>
           <w:szCs w:val="24"/>
-          <w:lang w:val="en-US"/>
-        </w:rPr>
-        <w:instrText xml:space="preserve"> ADDIN ZOTERO_ITEM CSL_CITATION {"citationID":"JCibVKJW","properties":{"formattedCitation":"(Kasahara-Kiritani et\\uc0\\u160{}al., 2018)","plainCitation":"(Kasahara-Kiritani et al., 2018)","dontUpdate":true,"noteIndex":0},"citationItems":[{"id":3432,"uris":["http://zotero.org/users/10015858/items/G9GRN5CN"],"itemData":{"id":3432,"type":"article-journal","abstract":"Aim\nThe purpose was to characterize public perceptions in Japan of mental illness and how they related to stigma-related attitudes for the same.\nMethods\nData were obtained using a vignette survey conducted as a part of the Stigma in Global Context - Mental Health Study and contained a nationally representative sample (n = 994). The survey was conducted using a multi-mode approach (face-to-face interviews, the drop-off-and-pick-up, postal collection) from September to December 2006, with a multi-stage probability sample of Japanese residents aged 18–64 years. Respondents were randomly assigned one of four vignette conditions that described psychiatric disorders meeting the diagnostic criteria for schizophrenia and major depressive disorder (one vignette for each gender exhibiting each diagnosis). We compared respondents’ stigma-related attitudes and perceptions toward mental illness between vignettes.\nResults\nOver 80% of Japanese participants believed that depressive disorder or schizophrenia could be cured via treatment. However, Japanese people still had relatively strong vigilance and denial of competency toward schizophrenia.\nConclusions\nParticipants expressed the belief that mental illnesses are curable, but stigma toward people with schizophrenia was still relatively strong.","container-title":"Asian Journal of Psychiatry","DOI":"10.1016/j.ajp.2018.05.021","ISSN":"1876-2018","journalAbbreviation":"Asian Journal of Psychiatry","page":"55-60","source":"ScienceDirect","title":"Public perceptions toward mental illness in Japan","volume":"35","author":[{"family":"Kasahara-Kiritani","given":"Mami"},{"family":"Matoba","given":"Tomoko"},{"family":"Kikuzawa","given":"Saeko"},{"family":"Sakano","given":"Junko"},{"family":"Sugiyama","given":"Katsumi"},{"family":"Yamaki","given":"Chikako"},{"family":"Mochizuki","given":"Mieko"},{"family":"Yamazaki","given":"Yoshihiko"}],"issued":{"date-parts":[["2018",6,1]]}}}],"schema":"https://github.com/citation-style-language/schema/raw/master/csl-citation.json"} </w:instrText>
+          <w:lang w:val="en-GB"/>
+        </w:rPr>
+        <w:instrText xml:space="preserve"> ADDIN ZOTERO_ITEM CSL_CITATION {"citationID":"xwNMfJ0Y","properties":{"formattedCitation":"(Sowislo et\\uc0\\u160{}al., 2017)","plainCitation":"(Sowislo et al., 2017)","dontUpdate":true,"noteIndex":0},"citationItems":[{"id":3440,"uris":["http://zotero.org/users/10015858/items/IHHCJJWJ"],"itemData":{"id":3440,"type":"article-journal","abstract":"Perceptions of dangerousness are an influential component of mental health stigma and can be driven by the display of psychiatric symptoms and the use of psychiatric service institutions. Yet, no previous study compared symptoms and service use associated perceptions of dangerousness. Therefore, we conducted a representative survey (N = 2,207) in the canton of Basel-Stadt, Switzerland. Participants were asked to answer the perceived dangerousness scale with respect to a vignette that either depicted psychiatric symptoms of a fictitious character or a psychiatric service institution the fictitious character had been admitted to. Between the vignettes, type of symptoms, type of psychiatric service, dangerousness, and gender were systematically varied. Perceived dangerousness was significantly lower as related to psychiatric service use than related to psychiatric symptoms. Overall, symptoms of alcohol dependency, behavior endangering others, and male gender of the fictitious character tend to increase perceived dangerousness. Furthermore, being hospitalized in a psychiatric unit at a general hospital or the rater being familiar with psychiatric services tends to decrease perceived dangerousness. Effective anti-stigma initiatives should integrate education about dangerousness as well as methods to increase familiarity with psychiatry. Additionally, an integration of modern psychiatry in somato-medical care institutions might decrease stigmatization.","container-title":"Scientific Reports","DOI":"10.1038/srep45716","ISSN":"2045-2322","issue":"1","journalAbbreviation":"Sci Rep","language":"en","license":"2017 The Author(s)","note":"publisher: Nature Publishing Group","page":"45716","source":"www.nature.com","title":"Perceived Dangerousness as Related to Psychiatric Symptoms and Psychiatric Service Use – a Vignette Based Representative Population Survey","volume":"7","author":[{"family":"Sowislo","given":"Julia F."},{"family":"Gonet-Wirz","given":"Franca"},{"family":"Borgwardt","given":"Stefan"},{"family":"Lang","given":"Undine E."},{"family":"Huber","given":"Christian G."}],"issued":{"date-parts":[["2017",4,3]]}}}],"schema":"https://github.com/citation-style-language/schema/raw/master/csl-citation.json"} </w:instrText>
       </w:r>
       <w:r>
         <w:rPr>
@@ -4069,7 +4392,7 @@
           <w:szCs w:val="24"/>
           <w:lang w:val="en-US"/>
         </w:rPr>
-        <w:t>(2018)</w:t>
+        <w:t>(2017)</w:t>
       </w:r>
       <w:r>
         <w:rPr>
@@ -4086,155 +4409,6 @@
           <w:szCs w:val="24"/>
           <w:lang w:val="en-US"/>
         </w:rPr>
-        <w:t>, in Japan, where men with depression we</w:t>
-      </w:r>
-      <w:r>
-        <w:rPr>
-          <w:rFonts w:ascii="Times New Roman" w:hAnsi="Times New Roman" w:cs="Times New Roman"/>
-          <w:sz w:val="24"/>
-          <w:szCs w:val="24"/>
-          <w:lang w:val="en-US"/>
-        </w:rPr>
-        <w:t xml:space="preserve">re more stigmatized than women. </w:t>
-      </w:r>
-      <w:r>
-        <w:rPr>
-          <w:rFonts w:ascii="Times New Roman" w:hAnsi="Times New Roman" w:cs="Times New Roman"/>
-          <w:sz w:val="24"/>
-          <w:szCs w:val="24"/>
-          <w:lang w:val="en-GB"/>
-        </w:rPr>
-        <w:t xml:space="preserve">Anderson et al. </w:t>
-      </w:r>
-      <w:r>
-        <w:rPr>
-          <w:rFonts w:ascii="Times New Roman" w:hAnsi="Times New Roman" w:cs="Times New Roman"/>
-          <w:sz w:val="24"/>
-          <w:szCs w:val="24"/>
-        </w:rPr>
-        <w:fldChar w:fldCharType="begin"/>
-      </w:r>
-      <w:r>
-        <w:rPr>
-          <w:rFonts w:ascii="Times New Roman" w:hAnsi="Times New Roman" w:cs="Times New Roman"/>
-          <w:sz w:val="24"/>
-          <w:szCs w:val="24"/>
-          <w:lang w:val="en-GB"/>
-        </w:rPr>
-        <w:instrText xml:space="preserve"> ADDIN ZOTERO_ITEM CSL_CITATION {"citationID":"UyJRDQGr","properties":{"formattedCitation":"(Anderson et\\uc0\\u160{}al., 2015)","plainCitation":"(Anderson et al., 2015)","dontUpdate":true,"noteIndex":0},"citationItems":[{"id":3435,"uris":["http://zotero.org/users/10015858/items/YVNU5ISR"],"itemData":{"id":3435,"type":"article-journal","abstract":"Despite the availability of effective interventions, most individuals with social anxiety disorder do not seek treatment. Given their fear of negative evaluation, socially anxious individuals might be especially susceptible to stigma concerns, a recognized barrier for mental health treatment. However, very little is known about the stigma specific to social anxiety disorder. In a design similar to Feldman and Crandall (2007), university undergraduate students read vignettes about target individuals with a generic mental illness label, major depressive disorder, and social anxiety disorder. Subjects rated each of 3 people in the vignettes on social distance and 17 dimensions including dangerousness, heritability and prevalence of the disorder, and gender ratio. Results indicated that being male and not having experience with mental health treatment was associated with somewhat greater preferred social distance. Multiple regression analyses revealed that being embarrassed by the disorder and dangerousness predicted social distance across all 3 vignettes. The vignette for social anxiety disorder had the most complex model and included work impairment, more common among women, and more avoidable. These results have implications for understanding the specific aspects of the stigma associated with social anxiety disorder. Public service messages to reduce stigma should focus on more accurate information about dangerousness and mental illness, given this is an established aspect of mental illness stigma. More nuanced messages about social anxiety might be best incorporated into the treatment referral process and as part of treatment. (PsycINFO Database Record (c) 2016 APA, all rights reserved)","container-title":"American Journal of Orthopsychiatry","DOI":"10.1037/ort0000046","ISSN":"1939-0025","issue":"2","note":"publisher-place: US\npublisher: Educational Publishing Foundation","page":"131-138","source":"APA PsycNet","title":"How people evaluate others with social anxiety disorder: A comparison to depression and general mental illness stigma","title-short":"How people evaluate others with social anxiety disorder","volume":"85","author":[{"family":"Anderson","given":"Kristin N."},{"family":"Jeon","given":"Andrew B."},{"family":"Blenner","given":"Jordan A."},{"family":"Wiener","given":"Richard L."},{"family":"Hope","given":"Debra A."}],"issued":{"date-parts":[["2015"]]}}}],"schema":"https://github.com/citation-style-language/schema/raw/master/csl-citation.json"} </w:instrText>
-      </w:r>
-      <w:r>
-        <w:rPr>
-          <w:rFonts w:ascii="Times New Roman" w:hAnsi="Times New Roman" w:cs="Times New Roman"/>
-          <w:sz w:val="24"/>
-          <w:szCs w:val="24"/>
-        </w:rPr>
-        <w:fldChar w:fldCharType="separate"/>
-      </w:r>
-      <w:r>
-        <w:rPr>
-          <w:rFonts w:ascii="Times New Roman" w:hAnsi="Times New Roman" w:cs="Times New Roman"/>
-          <w:sz w:val="24"/>
-          <w:szCs w:val="24"/>
-          <w:lang w:val="en-US"/>
-        </w:rPr>
-        <w:t>(2015)</w:t>
-      </w:r>
-      <w:r>
-        <w:rPr>
-          <w:rFonts w:ascii="Times New Roman" w:hAnsi="Times New Roman" w:cs="Times New Roman"/>
-          <w:sz w:val="24"/>
-          <w:szCs w:val="24"/>
-        </w:rPr>
-        <w:fldChar w:fldCharType="end"/>
-      </w:r>
-      <w:r>
-        <w:rPr>
-          <w:rFonts w:ascii="Times New Roman" w:hAnsi="Times New Roman" w:cs="Times New Roman"/>
-          <w:sz w:val="24"/>
-          <w:szCs w:val="24"/>
-          <w:lang w:val="en-US"/>
-        </w:rPr>
-        <w:t xml:space="preserve">, who found that the vignette of a man who was not under treatment was associated with a greater desire for social distance than the vignette of a woman. </w:t>
-      </w:r>
-      <w:r>
-        <w:rPr>
-          <w:rFonts w:ascii="Times New Roman" w:hAnsi="Times New Roman" w:cs="Times New Roman"/>
-          <w:sz w:val="24"/>
-          <w:szCs w:val="24"/>
-          <w:lang w:val="en-GB"/>
-        </w:rPr>
-        <w:t xml:space="preserve">In the same vein, </w:t>
-      </w:r>
-      <w:proofErr w:type="spellStart"/>
-      <w:r>
-        <w:rPr>
-          <w:rFonts w:ascii="Times New Roman" w:hAnsi="Times New Roman" w:cs="Times New Roman"/>
-          <w:sz w:val="24"/>
-          <w:szCs w:val="24"/>
-          <w:lang w:val="en-GB"/>
-        </w:rPr>
-        <w:t>Sowislo</w:t>
-      </w:r>
-      <w:proofErr w:type="spellEnd"/>
-      <w:r>
-        <w:rPr>
-          <w:rFonts w:ascii="Times New Roman" w:hAnsi="Times New Roman" w:cs="Times New Roman"/>
-          <w:sz w:val="24"/>
-          <w:szCs w:val="24"/>
-          <w:lang w:val="en-GB"/>
-        </w:rPr>
-        <w:t xml:space="preserve"> et al. </w:t>
-      </w:r>
-      <w:r>
-        <w:rPr>
-          <w:rFonts w:ascii="Times New Roman" w:hAnsi="Times New Roman" w:cs="Times New Roman"/>
-          <w:sz w:val="24"/>
-          <w:szCs w:val="24"/>
-        </w:rPr>
-        <w:fldChar w:fldCharType="begin"/>
-      </w:r>
-      <w:r>
-        <w:rPr>
-          <w:rFonts w:ascii="Times New Roman" w:hAnsi="Times New Roman" w:cs="Times New Roman"/>
-          <w:sz w:val="24"/>
-          <w:szCs w:val="24"/>
-          <w:lang w:val="en-GB"/>
-        </w:rPr>
-        <w:instrText xml:space="preserve"> ADDIN ZOTERO_ITEM CSL_CITATION {"citationID":"xwNMfJ0Y","properties":{"formattedCitation":"(Sowislo et\\uc0\\u160{}al., 2017)","plainCitation":"(Sowislo et al., 2017)","dontUpdate":true,"noteIndex":0},"citationItems":[{"id":3440,"uris":["http://zotero.org/users/10015858/items/IHHCJJWJ"],"itemData":{"id":3440,"type":"article-journal","abstract":"Perceptions of dangerousness are an influential component of mental health stigma and can be driven by the display of psychiatric symptoms and the use of psychiatric service institutions. Yet, no previous study compared symptoms and service use associated perceptions of dangerousness. Therefore, we conducted a representative survey (N = 2,207) in the canton of Basel-Stadt, Switzerland. Participants were asked to answer the perceived dangerousness scale with respect to a vignette that either depicted psychiatric symptoms of a fictitious character or a psychiatric service institution the fictitious character had been admitted to. Between the vignettes, type of symptoms, type of psychiatric service, dangerousness, and gender were systematically varied. Perceived dangerousness was significantly lower as related to psychiatric service use than related to psychiatric symptoms. Overall, symptoms of alcohol dependency, behavior endangering others, and male gender of the fictitious character tend to increase perceived dangerousness. Furthermore, being hospitalized in a psychiatric unit at a general hospital or the rater being familiar with psychiatric services tends to decrease perceived dangerousness. Effective anti-stigma initiatives should integrate education about dangerousness as well as methods to increase familiarity with psychiatry. Additionally, an integration of modern psychiatry in somato-medical care institutions might decrease stigmatization.","container-title":"Scientific Reports","DOI":"10.1038/srep45716","ISSN":"2045-2322","issue":"1","journalAbbreviation":"Sci Rep","language":"en","license":"2017 The Author(s)","note":"publisher: Nature Publishing Group","page":"45716","source":"www.nature.com","title":"Perceived Dangerousness as Related to Psychiatric Symptoms and Psychiatric Service Use – a Vignette Based Representative Population Survey","volume":"7","author":[{"family":"Sowislo","given":"Julia F."},{"family":"Gonet-Wirz","given":"Franca"},{"family":"Borgwardt","given":"Stefan"},{"family":"Lang","given":"Undine E."},{"family":"Huber","given":"Christian G."}],"issued":{"date-parts":[["2017",4,3]]}}}],"schema":"https://github.com/citation-style-language/schema/raw/master/csl-citation.json"} </w:instrText>
-      </w:r>
-      <w:r>
-        <w:rPr>
-          <w:rFonts w:ascii="Times New Roman" w:hAnsi="Times New Roman" w:cs="Times New Roman"/>
-          <w:sz w:val="24"/>
-          <w:szCs w:val="24"/>
-        </w:rPr>
-        <w:fldChar w:fldCharType="separate"/>
-      </w:r>
-      <w:r>
-        <w:rPr>
-          <w:rFonts w:ascii="Times New Roman" w:hAnsi="Times New Roman" w:cs="Times New Roman"/>
-          <w:sz w:val="24"/>
-          <w:szCs w:val="24"/>
-          <w:lang w:val="en-US"/>
-        </w:rPr>
-        <w:t>(2017)</w:t>
-      </w:r>
-      <w:r>
-        <w:rPr>
-          <w:rFonts w:ascii="Times New Roman" w:hAnsi="Times New Roman" w:cs="Times New Roman"/>
-          <w:sz w:val="24"/>
-          <w:szCs w:val="24"/>
-        </w:rPr>
-        <w:fldChar w:fldCharType="end"/>
-      </w:r>
-      <w:r>
-        <w:rPr>
-          <w:rFonts w:ascii="Times New Roman" w:hAnsi="Times New Roman" w:cs="Times New Roman"/>
-          <w:sz w:val="24"/>
-          <w:szCs w:val="24"/>
-          <w:lang w:val="en-US"/>
-        </w:rPr>
         <w:t xml:space="preserve"> in Switzerland, found greater perceived dangerousness in the vignette of a male with schizophrenia versus a female-gendered vignette.</w:t>
       </w:r>
       <w:r>
@@ -4244,7 +4418,27 @@
           <w:szCs w:val="24"/>
           <w:lang w:val="en-US"/>
         </w:rPr>
-        <w:t xml:space="preserve"> And Barthels, Hanewinkel &amp; Morgenstern (2025), found that stigmatization of gambling disorder were higher in men vignettes compared to female.</w:t>
+        <w:t xml:space="preserve"> And Barthels, Hanewinkel &amp; Morgenstern (2025), found that stigmatization of gambling disorder </w:t>
+      </w:r>
+      <w:proofErr w:type="gramStart"/>
+      <w:r>
+        <w:rPr>
+          <w:rFonts w:ascii="Times New Roman" w:hAnsi="Times New Roman" w:cs="Times New Roman"/>
+          <w:sz w:val="24"/>
+          <w:szCs w:val="24"/>
+          <w:lang w:val="en-US"/>
+        </w:rPr>
+        <w:t>were</w:t>
+      </w:r>
+      <w:proofErr w:type="gramEnd"/>
+      <w:r>
+        <w:rPr>
+          <w:rFonts w:ascii="Times New Roman" w:hAnsi="Times New Roman" w:cs="Times New Roman"/>
+          <w:sz w:val="24"/>
+          <w:szCs w:val="24"/>
+          <w:lang w:val="en-US"/>
+        </w:rPr>
+        <w:t xml:space="preserve"> higher in men vignettes compared to female.</w:t>
       </w:r>
       <w:r>
         <w:rPr>
@@ -6038,16 +6232,56 @@
           <w:szCs w:val="24"/>
           <w:lang w:val="en-US"/>
         </w:rPr>
-        <w:t>) and Tucker–Lewis index (</w:t>
-      </w:r>
-      <w:r>
-        <w:rPr>
-          <w:rFonts w:ascii="Times New Roman" w:hAnsi="Times New Roman" w:cs="Times New Roman"/>
-          <w:sz w:val="24"/>
-          <w:szCs w:val="24"/>
-          <w:lang w:val="en-US"/>
-        </w:rPr>
-        <w:t>TLI) are reported. The investigation of possible non-independent item structure is carried out with Exploratory Factor Analysis and the factor recommendation algorithms MAP (</w:t>
+        <w:t>) and Tucker–</w:t>
+      </w:r>
+      <w:proofErr w:type="gramStart"/>
+      <w:r>
+        <w:rPr>
+          <w:rFonts w:ascii="Times New Roman" w:hAnsi="Times New Roman" w:cs="Times New Roman"/>
+          <w:sz w:val="24"/>
+          <w:szCs w:val="24"/>
+          <w:lang w:val="en-US"/>
+        </w:rPr>
+        <w:t>Lewis</w:t>
+      </w:r>
+      <w:proofErr w:type="gramEnd"/>
+      <w:r>
+        <w:rPr>
+          <w:rFonts w:ascii="Times New Roman" w:hAnsi="Times New Roman" w:cs="Times New Roman"/>
+          <w:sz w:val="24"/>
+          <w:szCs w:val="24"/>
+          <w:lang w:val="en-US"/>
+        </w:rPr>
+        <w:t xml:space="preserve"> index (</w:t>
+      </w:r>
+      <w:r>
+        <w:rPr>
+          <w:rFonts w:ascii="Times New Roman" w:hAnsi="Times New Roman" w:cs="Times New Roman"/>
+          <w:sz w:val="24"/>
+          <w:szCs w:val="24"/>
+          <w:lang w:val="en-US"/>
+        </w:rPr>
+        <w:t xml:space="preserve">TLI) </w:t>
+      </w:r>
+      <w:proofErr w:type="gramStart"/>
+      <w:r>
+        <w:rPr>
+          <w:rFonts w:ascii="Times New Roman" w:hAnsi="Times New Roman" w:cs="Times New Roman"/>
+          <w:sz w:val="24"/>
+          <w:szCs w:val="24"/>
+          <w:lang w:val="en-US"/>
+        </w:rPr>
+        <w:t>are</w:t>
+      </w:r>
+      <w:proofErr w:type="gramEnd"/>
+      <w:r>
+        <w:rPr>
+          <w:rFonts w:ascii="Times New Roman" w:hAnsi="Times New Roman" w:cs="Times New Roman"/>
+          <w:sz w:val="24"/>
+          <w:szCs w:val="24"/>
+          <w:lang w:val="en-US"/>
+        </w:rPr>
+        <w:t xml:space="preserve"> reported. The investigation of possible non-independent item structure is carried out with Exploratory Factor Analysis and the factor recommendation algorithms MAP (</w:t>
       </w:r>
       <w:proofErr w:type="spellStart"/>
       <w:r>
@@ -6169,7 +6403,27 @@
           <w:szCs w:val="24"/>
           <w:lang w:val="en-US"/>
         </w:rPr>
-        <w:t xml:space="preserve"> package. Results are provided for configural invariance (similar factor structure between groups), metric invariance (similar factor loadings between groups) and scalar invariance (similar intercepts between groups). For each level of invariance, the usual fit indicators and the contrast between models are provided. The estimation method was also ML and invariance was studied for both respondent gender and questionnaire version.</w:t>
+        <w:t xml:space="preserve"> package. Results are provided for configural invariance (similar factor structure between groups), metric invariance (similar factor loadings between groups) and scalar invariance (similar intercepts between groups). For each level of invariance, the usual fit indicators and the contrast between models are provided. The estimation method was also </w:t>
+      </w:r>
+      <w:proofErr w:type="gramStart"/>
+      <w:r>
+        <w:rPr>
+          <w:rFonts w:ascii="Times New Roman" w:hAnsi="Times New Roman" w:cs="Times New Roman"/>
+          <w:sz w:val="24"/>
+          <w:szCs w:val="24"/>
+          <w:lang w:val="en-US"/>
+        </w:rPr>
+        <w:t>ML</w:t>
+      </w:r>
+      <w:proofErr w:type="gramEnd"/>
+      <w:r>
+        <w:rPr>
+          <w:rFonts w:ascii="Times New Roman" w:hAnsi="Times New Roman" w:cs="Times New Roman"/>
+          <w:sz w:val="24"/>
+          <w:szCs w:val="24"/>
+          <w:lang w:val="en-US"/>
+        </w:rPr>
+        <w:t xml:space="preserve"> and invariance was studied for both respondent gender and questionnaire version.</w:t>
       </w:r>
       <w:r>
         <w:rPr>
@@ -6597,7 +6851,29 @@
           <w:szCs w:val="24"/>
           <w:lang w:val="en-US"/>
         </w:rPr>
-        <w:t xml:space="preserve">The fit indices indicate that the models are well fitted to the empirical data, with all RMSA values being less than .05, </w:t>
+        <w:t xml:space="preserve">The fit indices indicate that the models are well fitted </w:t>
+      </w:r>
+      <w:proofErr w:type="gramStart"/>
+      <w:r>
+        <w:rPr>
+          <w:rFonts w:ascii="Times New Roman" w:hAnsi="Times New Roman" w:cs="Times New Roman"/>
+          <w:bCs/>
+          <w:sz w:val="24"/>
+          <w:szCs w:val="24"/>
+          <w:lang w:val="en-US"/>
+        </w:rPr>
+        <w:t>to</w:t>
+      </w:r>
+      <w:proofErr w:type="gramEnd"/>
+      <w:r>
+        <w:rPr>
+          <w:rFonts w:ascii="Times New Roman" w:hAnsi="Times New Roman" w:cs="Times New Roman"/>
+          <w:bCs/>
+          <w:sz w:val="24"/>
+          <w:szCs w:val="24"/>
+          <w:lang w:val="en-US"/>
+        </w:rPr>
+        <w:t xml:space="preserve"> the empirical data, with all RMSA values being less than .05, </w:t>
       </w:r>
       <w:r>
         <w:rPr>
@@ -10682,7 +10958,27 @@
           <w:szCs w:val="24"/>
           <w:lang w:val="en-US"/>
         </w:rPr>
-        <w:t xml:space="preserve">than a woman. As well as being in line with the findings of Anderson et al. (2015), where in their vignettes men generated more desire for social distance. In addition, it should be noted that the vignette used in the present study includes the diagnosis of schizophrenia, which is more typically male, so perhaps, as other authors have pointed out, </w:t>
+        <w:t xml:space="preserve">than a woman. As well as being in line with the findings of Anderson et al. (2015), where in their </w:t>
+      </w:r>
+      <w:proofErr w:type="gramStart"/>
+      <w:r>
+        <w:rPr>
+          <w:rFonts w:ascii="Times New Roman" w:hAnsi="Times New Roman" w:cs="Times New Roman"/>
+          <w:sz w:val="24"/>
+          <w:szCs w:val="24"/>
+          <w:lang w:val="en-US"/>
+        </w:rPr>
+        <w:t>vignettes</w:t>
+      </w:r>
+      <w:proofErr w:type="gramEnd"/>
+      <w:r>
+        <w:rPr>
+          <w:rFonts w:ascii="Times New Roman" w:hAnsi="Times New Roman" w:cs="Times New Roman"/>
+          <w:sz w:val="24"/>
+          <w:szCs w:val="24"/>
+          <w:lang w:val="en-US"/>
+        </w:rPr>
+        <w:t xml:space="preserve"> men generated more desire for social distance. In addition, it should be noted that the vignette used in the present study includes the diagnosis of schizophrenia, which is more typically male, so perhaps, as other authors have pointed out, </w:t>
       </w:r>
       <w:proofErr w:type="spellStart"/>
       <w:r>
@@ -10865,7 +11161,27 @@
           <w:szCs w:val="24"/>
           <w:lang w:val="en-US"/>
         </w:rPr>
-        <w:t xml:space="preserve"> disorders such as Specific Phobia are perceived more positively on both dimensions. In the same vein, Boysen (2017) finds that low warmth and stereotypically masculine disorders such as schizophrenia consistently elicit negative emotions and </w:t>
+        <w:t xml:space="preserve"> disorders such as Specific Phobia are perceived more positively </w:t>
+      </w:r>
+      <w:proofErr w:type="gramStart"/>
+      <w:r>
+        <w:rPr>
+          <w:rFonts w:ascii="Times New Roman" w:hAnsi="Times New Roman" w:cs="Times New Roman"/>
+          <w:sz w:val="24"/>
+          <w:szCs w:val="24"/>
+          <w:lang w:val="en-US"/>
+        </w:rPr>
+        <w:t>on</w:t>
+      </w:r>
+      <w:proofErr w:type="gramEnd"/>
+      <w:r>
+        <w:rPr>
+          <w:rFonts w:ascii="Times New Roman" w:hAnsi="Times New Roman" w:cs="Times New Roman"/>
+          <w:sz w:val="24"/>
+          <w:szCs w:val="24"/>
+          <w:lang w:val="en-US"/>
+        </w:rPr>
+        <w:t xml:space="preserve"> both dimensions. In the same vein, Boysen (2017) finds that low warmth and stereotypically masculine disorders such as schizophrenia consistently elicit negative emotions and </w:t>
       </w:r>
       <w:proofErr w:type="spellStart"/>
       <w:r>
@@ -11112,7 +11428,27 @@
           <w:szCs w:val="24"/>
           <w:lang w:val="en-US"/>
         </w:rPr>
-        <w:t>This study has interesting practical implications, as it may also impact policies related to stigma. It is essential to include gender in the construction of questionnaires, as well as to take the intersectional paradigm into account. Stigma is a construct closely linked to gender, and clinicians and policymakers should be aware that existing traditional instruments have certain limitations that do not capture these implications. Greater investment should be made in the development of questionnaires that address these biases to ensure appropriate assessment, as well as in training professionals on gender-related issues. Moreover, considering the gender-based differences in attitudes when designing anti-stigma prevention and intervention campaigns would help make them more effective.</w:t>
+        <w:t xml:space="preserve">This study has interesting practical implications, as it may also impact policies related to stigma. It is essential to include gender in the construction of questionnaires, as well as to take the intersectional paradigm into account. Stigma is a construct closely linked to gender, and clinicians and policymakers should be aware that existing traditional instruments have certain limitations that do not capture these implications. Greater investment should be made in the development of questionnaires that address these biases to ensure appropriate assessment, as well as in training professionals </w:t>
+      </w:r>
+      <w:proofErr w:type="gramStart"/>
+      <w:r>
+        <w:rPr>
+          <w:rFonts w:ascii="Times New Roman" w:hAnsi="Times New Roman" w:cs="Times New Roman"/>
+          <w:sz w:val="24"/>
+          <w:szCs w:val="24"/>
+          <w:lang w:val="en-US"/>
+        </w:rPr>
+        <w:t>on</w:t>
+      </w:r>
+      <w:proofErr w:type="gramEnd"/>
+      <w:r>
+        <w:rPr>
+          <w:rFonts w:ascii="Times New Roman" w:hAnsi="Times New Roman" w:cs="Times New Roman"/>
+          <w:sz w:val="24"/>
+          <w:szCs w:val="24"/>
+          <w:lang w:val="en-US"/>
+        </w:rPr>
+        <w:t xml:space="preserve"> gender-related issues. Moreover, considering the gender-based differences in attitudes when designing anti-stigma prevention and intervention campaigns would help make them more effective.</w:t>
       </w:r>
     </w:p>
     <w:bookmarkEnd w:id="7"/>
@@ -13092,19 +13428,32 @@
         </w:rPr>
         <w:t xml:space="preserve">1069226. </w:t>
       </w:r>
-      <w:hyperlink r:id="rId8" w:history="1">
-        <w:r>
-          <w:rPr>
-            <w:rStyle w:val="Hipervnculo"/>
-            <w:rFonts w:ascii="Times New Roman" w:hAnsi="Times New Roman" w:cs="Times New Roman"/>
-            <w:color w:val="auto"/>
-            <w:sz w:val="24"/>
-            <w:szCs w:val="24"/>
-            <w:lang w:val="en-US"/>
-          </w:rPr>
-          <w:t>https://doi.org/10.3389/fpsyg.2023.1069226</w:t>
-        </w:r>
-      </w:hyperlink>
+      <w:r>
+        <w:fldChar w:fldCharType="begin"/>
+      </w:r>
+      <w:r>
+        <w:rPr>
+          <w:lang w:val="en-US"/>
+        </w:rPr>
+        <w:instrText>HYPERLINK "https://doi.org/10.3389/fpsyg.2023.1069226"</w:instrText>
+      </w:r>
+      <w:r>
+        <w:fldChar w:fldCharType="separate"/>
+      </w:r>
+      <w:r>
+        <w:rPr>
+          <w:rStyle w:val="Hipervnculo"/>
+          <w:rFonts w:ascii="Times New Roman" w:hAnsi="Times New Roman" w:cs="Times New Roman"/>
+          <w:color w:val="auto"/>
+          <w:sz w:val="24"/>
+          <w:szCs w:val="24"/>
+          <w:lang w:val="en-US"/>
+        </w:rPr>
+        <w:t>https://doi.org/10.3389/fpsyg.2023.1069226</w:t>
+      </w:r>
+      <w:r>
+        <w:fldChar w:fldCharType="end"/>
+      </w:r>
     </w:p>
     <w:p>
       <w:pPr>
@@ -13869,19 +14218,32 @@
         </w:rPr>
         <w:t xml:space="preserve">(5), 933–938. </w:t>
       </w:r>
-      <w:hyperlink r:id="rId9" w:history="1">
-        <w:r>
-          <w:rPr>
-            <w:rStyle w:val="Hipervnculo"/>
-            <w:rFonts w:ascii="Times New Roman" w:hAnsi="Times New Roman" w:cs="Times New Roman"/>
-            <w:color w:val="auto"/>
-            <w:sz w:val="24"/>
-            <w:szCs w:val="24"/>
-            <w:lang w:val="en-US"/>
-          </w:rPr>
-          <w:t>https://doi.org/10.1007/s10597-020-00559-x</w:t>
-        </w:r>
-      </w:hyperlink>
+      <w:r>
+        <w:fldChar w:fldCharType="begin"/>
+      </w:r>
+      <w:r>
+        <w:rPr>
+          <w:lang w:val="en-US"/>
+        </w:rPr>
+        <w:instrText>HYPERLINK "https://doi.org/10.1007/s10597-020-00559-x"</w:instrText>
+      </w:r>
+      <w:r>
+        <w:fldChar w:fldCharType="separate"/>
+      </w:r>
+      <w:r>
+        <w:rPr>
+          <w:rStyle w:val="Hipervnculo"/>
+          <w:rFonts w:ascii="Times New Roman" w:hAnsi="Times New Roman" w:cs="Times New Roman"/>
+          <w:color w:val="auto"/>
+          <w:sz w:val="24"/>
+          <w:szCs w:val="24"/>
+          <w:lang w:val="en-US"/>
+        </w:rPr>
+        <w:t>https://doi.org/10.1007/s10597-020-00559-x</w:t>
+      </w:r>
+      <w:r>
+        <w:fldChar w:fldCharType="end"/>
+      </w:r>
     </w:p>
     <w:p>
       <w:pPr>
@@ -13950,7 +14312,7 @@
           <w:rFonts w:ascii="Times New Roman" w:hAnsi="Times New Roman" w:cs="Times New Roman"/>
           <w:sz w:val="24"/>
           <w:szCs w:val="24"/>
-          <w:lang w:val="en-US"/>
+          <w:lang w:val="it-IT"/>
         </w:rPr>
       </w:pPr>
       <w:r>
@@ -13970,7 +14332,7 @@
           <w:iCs/>
           <w:sz w:val="24"/>
           <w:szCs w:val="24"/>
-          <w:lang w:val="en-GB"/>
+          <w:lang w:val="it-IT"/>
         </w:rPr>
         <w:t>Schizophrenia Bulletin</w:t>
       </w:r>
@@ -13979,7 +14341,7 @@
           <w:rFonts w:ascii="Times New Roman" w:hAnsi="Times New Roman" w:cs="Times New Roman"/>
           <w:sz w:val="24"/>
           <w:szCs w:val="24"/>
-          <w:lang w:val="en-GB"/>
+          <w:lang w:val="it-IT"/>
         </w:rPr>
         <w:t>, </w:t>
       </w:r>
@@ -13990,7 +14352,7 @@
           <w:iCs/>
           <w:sz w:val="24"/>
           <w:szCs w:val="24"/>
-          <w:lang w:val="en-GB"/>
+          <w:lang w:val="it-IT"/>
         </w:rPr>
         <w:t>30</w:t>
       </w:r>
@@ -13999,7 +14361,7 @@
           <w:rFonts w:ascii="Times New Roman" w:hAnsi="Times New Roman" w:cs="Times New Roman"/>
           <w:sz w:val="24"/>
           <w:szCs w:val="24"/>
-          <w:lang w:val="en-GB"/>
+          <w:lang w:val="it-IT"/>
         </w:rPr>
         <w:t>(3), 477–479. https://doi.org/10.1093/oxfordjournals.schbul.a007095</w:t>
       </w:r>
@@ -14019,7 +14381,7 @@
           <w:rFonts w:ascii="Times New Roman" w:hAnsi="Times New Roman" w:cs="Times New Roman"/>
           <w:sz w:val="24"/>
           <w:szCs w:val="24"/>
-          <w:lang w:val="en-GB"/>
+          <w:lang w:val="it-IT"/>
         </w:rPr>
         <w:t xml:space="preserve">Crenshaw, K. (1989). </w:t>
       </w:r>
@@ -14060,7 +14422,6 @@
           <w:rFonts w:ascii="Times New Roman" w:hAnsi="Times New Roman" w:cs="Times New Roman"/>
           <w:sz w:val="24"/>
           <w:szCs w:val="24"/>
-          <w:lang w:val="en-US"/>
         </w:rPr>
       </w:pPr>
       <w:r>
@@ -14079,7 +14440,6 @@
           <w:iCs/>
           <w:sz w:val="24"/>
           <w:szCs w:val="24"/>
-          <w:lang w:val="en-GB"/>
         </w:rPr>
         <w:t>Advances in Experimental Social Psychology, 40</w:t>
       </w:r>
@@ -14088,17 +14448,15 @@
           <w:rFonts w:ascii="Times New Roman" w:hAnsi="Times New Roman" w:cs="Times New Roman"/>
           <w:sz w:val="24"/>
           <w:szCs w:val="24"/>
-          <w:lang w:val="en-GB"/>
         </w:rPr>
         <w:t xml:space="preserve">, 61-149. </w:t>
       </w:r>
-      <w:hyperlink r:id="rId10" w:tgtFrame="_blank" w:tooltip="Persistent link using digital object identifier" w:history="1">
+      <w:hyperlink r:id="rId8" w:tgtFrame="_blank" w:tooltip="Persistent link using digital object identifier" w:history="1">
         <w:r>
           <w:rPr>
             <w:rFonts w:ascii="Times New Roman" w:hAnsi="Times New Roman" w:cs="Times New Roman"/>
             <w:sz w:val="24"/>
             <w:szCs w:val="24"/>
-            <w:lang w:val="en-GB"/>
           </w:rPr>
           <w:t>https://doi.org/10.1016/S0065-2601(07)00002-0</w:t>
         </w:r>
@@ -14119,7 +14477,6 @@
           <w:rFonts w:ascii="Times New Roman" w:hAnsi="Times New Roman" w:cs="Times New Roman"/>
           <w:sz w:val="24"/>
           <w:szCs w:val="24"/>
-          <w:lang w:val="en-US"/>
         </w:rPr>
         <w:t>Del Rosal, E., González-Sanguino, C., Bestea, S., Boyd, J., &amp; Muñoz, M. (202</w:t>
       </w:r>
@@ -14128,7 +14485,6 @@
           <w:rFonts w:ascii="Times New Roman" w:hAnsi="Times New Roman" w:cs="Times New Roman"/>
           <w:sz w:val="24"/>
           <w:szCs w:val="24"/>
-          <w:lang w:val="en-US"/>
         </w:rPr>
         <w:t>1</w:t>
       </w:r>
@@ -14137,9 +14493,17 @@
           <w:rFonts w:ascii="Times New Roman" w:hAnsi="Times New Roman" w:cs="Times New Roman"/>
           <w:sz w:val="24"/>
           <w:szCs w:val="24"/>
-          <w:lang w:val="en-US"/>
-        </w:rPr>
-        <w:t xml:space="preserve">). Correlates and consequences of internalized stigma assessed through the Internalized Stigma of Mental Illness Scale for people living with mental illness: A scoping review and meta-analysis from 2010. </w:t>
+        </w:rPr>
+        <w:t xml:space="preserve">). </w:t>
+      </w:r>
+      <w:r>
+        <w:rPr>
+          <w:rFonts w:ascii="Times New Roman" w:hAnsi="Times New Roman" w:cs="Times New Roman"/>
+          <w:sz w:val="24"/>
+          <w:szCs w:val="24"/>
+          <w:lang w:val="en-US"/>
+        </w:rPr>
+        <w:t xml:space="preserve">Correlates and consequences of internalized stigma assessed through the Internalized Stigma of Mental Illness Scale for people living with mental illness: A scoping review and meta-analysis from 2010. </w:t>
       </w:r>
       <w:r>
         <w:rPr>
@@ -14317,6 +14681,7 @@
           <w:rFonts w:ascii="Times New Roman" w:hAnsi="Times New Roman" w:cs="Times New Roman"/>
           <w:sz w:val="24"/>
           <w:szCs w:val="24"/>
+          <w:lang w:val="en-US"/>
         </w:rPr>
         <w:lastRenderedPageBreak/>
         <w:t>Fiske, S. T., &amp; Durante, F. (2016)</w:t>
@@ -14327,6 +14692,7 @@
           <w:rFonts w:ascii="Times New Roman" w:hAnsi="Times New Roman" w:cs="Times New Roman"/>
           <w:sz w:val="24"/>
           <w:szCs w:val="24"/>
+          <w:lang w:val="en-US"/>
         </w:rPr>
         <w:t xml:space="preserve">. </w:t>
       </w:r>
@@ -14721,9 +15087,18 @@
           <w:rFonts w:ascii="Times New Roman" w:hAnsi="Times New Roman" w:cs="Times New Roman"/>
           <w:sz w:val="24"/>
           <w:szCs w:val="24"/>
-          <w:lang w:val="en-US"/>
-        </w:rPr>
-        <w:t xml:space="preserve">Krzemieniecki, A., &amp; Gabriel, K. I. (2021). Stigmatization of posttraumatic stress disorder is altered by PTSD Knowledge and the precipitating trauma of the sufferer. </w:t>
+          <w:lang w:val="it-IT"/>
+        </w:rPr>
+        <w:t xml:space="preserve">Krzemieniecki, A., &amp; Gabriel, K. I. (2021). </w:t>
+      </w:r>
+      <w:r>
+        <w:rPr>
+          <w:rFonts w:ascii="Times New Roman" w:hAnsi="Times New Roman" w:cs="Times New Roman"/>
+          <w:sz w:val="24"/>
+          <w:szCs w:val="24"/>
+          <w:lang w:val="en-US"/>
+        </w:rPr>
+        <w:t xml:space="preserve">Stigmatization of posttraumatic stress disorder is altered by PTSD Knowledge and the precipitating trauma of the sufferer. </w:t>
       </w:r>
       <w:r>
         <w:rPr>
@@ -15102,7 +15477,6 @@
           <w:rFonts w:ascii="Times New Roman" w:hAnsi="Times New Roman" w:cs="Times New Roman"/>
           <w:sz w:val="24"/>
           <w:szCs w:val="24"/>
-          <w:lang w:val="en-US"/>
         </w:rPr>
       </w:pPr>
       <w:r>
@@ -15159,7 +15533,6 @@
           <w:rFonts w:ascii="Times New Roman" w:hAnsi="Times New Roman" w:cs="Times New Roman"/>
           <w:sz w:val="24"/>
           <w:szCs w:val="24"/>
-          <w:lang w:val="en-US"/>
         </w:rPr>
       </w:pPr>
       <w:r>
@@ -15774,21 +16147,43 @@
           <w:rFonts w:ascii="Times New Roman" w:hAnsi="Times New Roman" w:cs="Times New Roman"/>
           <w:sz w:val="24"/>
           <w:szCs w:val="24"/>
-          <w:lang w:val="en-US"/>
-        </w:rPr>
-        <w:t>Ottati, V., Bodenhausen, G. V., &amp; Newman, L. S. (2005). Social Psychological Models of Mental Illness Stigma. In P. W. Corrigan (Ed.), On the stigma of mental illness: Practical strategies for research and social change (pp. 99–128). American Psychological Association. </w:t>
-      </w:r>
-      <w:hyperlink r:id="rId11" w:tgtFrame="_blank" w:history="1">
-        <w:r>
-          <w:rPr>
-            <w:rFonts w:ascii="Times New Roman" w:hAnsi="Times New Roman" w:cs="Times New Roman"/>
-            <w:sz w:val="24"/>
-            <w:szCs w:val="24"/>
-            <w:lang w:val="en-US"/>
-          </w:rPr>
-          <w:t>https://doi.org/10.1037/10887-004</w:t>
-        </w:r>
-      </w:hyperlink>
+          <w:lang w:val="it-IT"/>
+        </w:rPr>
+        <w:t xml:space="preserve">Ottati, V., Bodenhausen, G. V., &amp; Newman, L. S. (2005). </w:t>
+      </w:r>
+      <w:r>
+        <w:rPr>
+          <w:rFonts w:ascii="Times New Roman" w:hAnsi="Times New Roman" w:cs="Times New Roman"/>
+          <w:sz w:val="24"/>
+          <w:szCs w:val="24"/>
+          <w:lang w:val="en-US"/>
+        </w:rPr>
+        <w:t>Social Psychological Models of Mental Illness Stigma. In P. W. Corrigan (Ed.), On the stigma of mental illness: Practical strategies for research and social change (pp. 99–128). American Psychological Association. </w:t>
+      </w:r>
+      <w:r>
+        <w:fldChar w:fldCharType="begin"/>
+      </w:r>
+      <w:r>
+        <w:rPr>
+          <w:lang w:val="en-US"/>
+        </w:rPr>
+        <w:instrText>HYPERLINK "https://psycnet.apa.org/doi/10.1037/10887-004" \t "_blank"</w:instrText>
+      </w:r>
+      <w:r>
+        <w:fldChar w:fldCharType="separate"/>
+      </w:r>
+      <w:r>
+        <w:rPr>
+          <w:rFonts w:ascii="Times New Roman" w:hAnsi="Times New Roman" w:cs="Times New Roman"/>
+          <w:sz w:val="24"/>
+          <w:szCs w:val="24"/>
+          <w:lang w:val="en-US"/>
+        </w:rPr>
+        <w:t>https://doi.org/10.1037/10887-004</w:t>
+      </w:r>
+      <w:r>
+        <w:fldChar w:fldCharType="end"/>
+      </w:r>
     </w:p>
     <w:p>
       <w:pPr>
@@ -16357,7 +16752,7 @@
           <w:rFonts w:ascii="Times New Roman" w:hAnsi="Times New Roman" w:cs="Times New Roman"/>
           <w:sz w:val="24"/>
           <w:szCs w:val="24"/>
-          <w:lang w:val="en-US"/>
+          <w:lang w:val="it-IT"/>
         </w:rPr>
       </w:pPr>
       <w:r>
@@ -16376,7 +16771,7 @@
           <w:iCs/>
           <w:sz w:val="24"/>
           <w:szCs w:val="24"/>
-          <w:lang w:val="en-US"/>
+          <w:lang w:val="it-IT"/>
         </w:rPr>
         <w:t>Schizophrenia Bulletin</w:t>
       </w:r>
@@ -16385,7 +16780,7 @@
           <w:rFonts w:ascii="Times New Roman" w:hAnsi="Times New Roman" w:cs="Times New Roman"/>
           <w:sz w:val="24"/>
           <w:szCs w:val="24"/>
-          <w:lang w:val="en-US"/>
+          <w:lang w:val="it-IT"/>
         </w:rPr>
         <w:t xml:space="preserve">, </w:t>
       </w:r>
@@ -16396,7 +16791,7 @@
           <w:iCs/>
           <w:sz w:val="24"/>
           <w:szCs w:val="24"/>
-          <w:lang w:val="en-US"/>
+          <w:lang w:val="it-IT"/>
         </w:rPr>
         <w:t>7</w:t>
       </w:r>
@@ -16405,7 +16800,7 @@
           <w:rFonts w:ascii="Times New Roman" w:hAnsi="Times New Roman" w:cs="Times New Roman"/>
           <w:sz w:val="24"/>
           <w:szCs w:val="24"/>
-          <w:lang w:val="en-US"/>
+          <w:lang w:val="it-IT"/>
         </w:rPr>
         <w:t>(2), 225-240. https://doi.org/10.1093/schbul/7.2.225</w:t>
       </w:r>
@@ -16425,9 +16820,18 @@
           <w:rFonts w:ascii="Times New Roman" w:hAnsi="Times New Roman" w:cs="Times New Roman"/>
           <w:sz w:val="24"/>
           <w:szCs w:val="24"/>
-          <w:lang w:val="en-US"/>
-        </w:rPr>
-        <w:t xml:space="preserve">Thi, L. M., Manzano, A., Ha, B. T. T., Vui, L. T., Quynh-Chi, N. T., Duong, D. T. T., Lakin, K., Kane, S., Mirzoev, T., &amp; Trang, D. T. H. (2024). Mental health stigma and health-seeking behaviors amongst pregnant women in Vietnam: A mixed-method realist study. </w:t>
+          <w:lang w:val="it-IT"/>
+        </w:rPr>
+        <w:t xml:space="preserve">Thi, L. M., Manzano, A., Ha, B. T. T., Vui, L. T., Quynh-Chi, N. T., Duong, D. T. T., Lakin, K., Kane, S., Mirzoev, T., &amp; Trang, D. T. H. (2024). </w:t>
+      </w:r>
+      <w:r>
+        <w:rPr>
+          <w:rFonts w:ascii="Times New Roman" w:hAnsi="Times New Roman" w:cs="Times New Roman"/>
+          <w:sz w:val="24"/>
+          <w:szCs w:val="24"/>
+          <w:lang w:val="en-US"/>
+        </w:rPr>
+        <w:t xml:space="preserve">Mental health stigma and health-seeking behaviors amongst pregnant women in Vietnam: A mixed-method realist study. </w:t>
       </w:r>
       <w:r>
         <w:rPr>
@@ -16765,19 +17169,32 @@
         </w:rPr>
         <w:t xml:space="preserve">e70031. </w:t>
       </w:r>
-      <w:hyperlink r:id="rId12" w:history="1">
-        <w:r>
-          <w:rPr>
-            <w:rStyle w:val="Hipervnculo"/>
-            <w:rFonts w:ascii="Times New Roman" w:hAnsi="Times New Roman" w:cs="Times New Roman"/>
-            <w:color w:val="auto"/>
-            <w:sz w:val="24"/>
-            <w:szCs w:val="24"/>
-            <w:lang w:val="en-US"/>
-          </w:rPr>
-          <w:t>https://doi.org/10.1002/ijop.70031</w:t>
-        </w:r>
-      </w:hyperlink>
+      <w:r>
+        <w:fldChar w:fldCharType="begin"/>
+      </w:r>
+      <w:r>
+        <w:rPr>
+          <w:lang w:val="en-US"/>
+        </w:rPr>
+        <w:instrText>HYPERLINK "https://doi.org/10.1002/ijop.70031"</w:instrText>
+      </w:r>
+      <w:r>
+        <w:fldChar w:fldCharType="separate"/>
+      </w:r>
+      <w:r>
+        <w:rPr>
+          <w:rStyle w:val="Hipervnculo"/>
+          <w:rFonts w:ascii="Times New Roman" w:hAnsi="Times New Roman" w:cs="Times New Roman"/>
+          <w:color w:val="auto"/>
+          <w:sz w:val="24"/>
+          <w:szCs w:val="24"/>
+          <w:lang w:val="en-US"/>
+        </w:rPr>
+        <w:t>https://doi.org/10.1002/ijop.70031</w:t>
+      </w:r>
+      <w:r>
+        <w:fldChar w:fldCharType="end"/>
+      </w:r>
     </w:p>
     <w:p>
       <w:pPr>
@@ -16846,7 +17263,6 @@
           <w:rFonts w:ascii="Times New Roman" w:hAnsi="Times New Roman" w:cs="Times New Roman"/>
           <w:sz w:val="24"/>
           <w:szCs w:val="24"/>
-          <w:lang w:val="en-US"/>
         </w:rPr>
       </w:pPr>
       <w:r>
@@ -18660,8 +19076,19 @@
                 <w:sz w:val="24"/>
                 <w:szCs w:val="24"/>
               </w:rPr>
-              <w:t>Marital status</w:t>
-            </w:r>
+              <w:t xml:space="preserve">Marital </w:t>
+            </w:r>
+            <w:proofErr w:type="gramStart"/>
+            <w:r>
+              <w:rPr>
+                <w:rFonts w:ascii="Times New Roman" w:hAnsi="Times New Roman" w:cs="Times New Roman"/>
+                <w:b/>
+                <w:sz w:val="24"/>
+                <w:szCs w:val="24"/>
+              </w:rPr>
+              <w:t>status</w:t>
+            </w:r>
+            <w:proofErr w:type="gramEnd"/>
           </w:p>
         </w:tc>
         <w:tc>
@@ -18715,6 +19142,7 @@
                 <w:szCs w:val="24"/>
               </w:rPr>
             </w:pPr>
+            <w:proofErr w:type="gramStart"/>
             <w:r>
               <w:rPr>
                 <w:rFonts w:ascii="Times New Roman" w:hAnsi="Times New Roman" w:cs="Times New Roman"/>
@@ -18723,6 +19151,7 @@
               </w:rPr>
               <w:t>Single</w:t>
             </w:r>
+            <w:proofErr w:type="gramEnd"/>
           </w:p>
         </w:tc>
         <w:tc>
@@ -30098,8 +30527,8 @@
       </w:pPr>
     </w:p>
     <w:sectPr>
-      <w:headerReference w:type="default" r:id="rId13"/>
-      <w:footerReference w:type="default" r:id="rId14"/>
+      <w:headerReference w:type="default" r:id="rId9"/>
+      <w:footerReference w:type="default" r:id="rId10"/>
       <w:pgSz w:w="11906" w:h="16838"/>
       <w:pgMar w:top="1701" w:right="1701" w:bottom="1701" w:left="1701" w:header="709" w:footer="709" w:gutter="0"/>
       <w:cols w:space="708"/>

</xml_diff>